<commit_message>
Add GitHub Repo Link to doc file
</commit_message>
<xml_diff>
--- a/app/stock_market_time_series_features.docx
+++ b/app/stock_market_time_series_features.docx
@@ -1551,6 +1551,35 @@
         </w:drawing>
       </w:r>
     </w:p>
+    <w:p/>
+    <w:p>
+      <w:pPr>
+        <w:rPr>
+          <w:b/>
+          <w:color w:val="2F5496"/>
+          <w:sz w:val="25"/>
+        </w:rPr>
+      </w:pPr>
+      <w:r>
+        <w:rPr>
+          <w:b/>
+          <w:color w:val="2F5496"/>
+          <w:sz w:val="25"/>
+        </w:rPr>
+        <w:t>GitHub Repository</w:t>
+      </w:r>
+    </w:p>
+    <w:p>
+      <w:hyperlink r:id="rId11" w:history="1">
+        <w:r>
+          <w:rPr>
+            <w:rStyle w:val="Hyperlink"/>
+          </w:rPr>
+          <w:t>https://github.com/sutomuz/cop-3701-stock-market-time-series-db/tree/app/chase</w:t>
+        </w:r>
+      </w:hyperlink>
+    </w:p>
+    <w:p/>
     <w:sectPr>
       <w:pgSz w:w="12240" w:h="15840"/>
       <w:pgMar w:top="936" w:right="1224" w:bottom="936" w:left="1224" w:header="720" w:footer="720" w:gutter="0"/>
@@ -13148,6 +13177,29 @@
       </w:tcPr>
     </w:tblStylePr>
   </w:style>
+  <w:style w:type="character" w:styleId="Hyperlink">
+    <w:name w:val="Hyperlink"/>
+    <w:basedOn w:val="DefaultParagraphFont"/>
+    <w:uiPriority w:val="99"/>
+    <w:unhideWhenUsed/>
+    <w:rsid w:val="004D48DC"/>
+    <w:rPr>
+      <w:color w:val="0000FF" w:themeColor="hyperlink"/>
+      <w:u w:val="single"/>
+    </w:rPr>
+  </w:style>
+  <w:style w:type="character" w:styleId="UnresolvedMention">
+    <w:name w:val="Unresolved Mention"/>
+    <w:basedOn w:val="DefaultParagraphFont"/>
+    <w:uiPriority w:val="99"/>
+    <w:semiHidden/>
+    <w:unhideWhenUsed/>
+    <w:rsid w:val="004D48DC"/>
+    <w:rPr>
+      <w:color w:val="605E5C"/>
+      <w:shd w:val="clear" w:color="auto" w:fill="E1DFDD"/>
+    </w:rPr>
+  </w:style>
 </w:styles>
 </file>
 

</xml_diff>